<commit_message>
fix(docs): corregir interpolacion de bash en tabla de costos de informe ejecutivo simple
</commit_message>
<xml_diff>
--- a/docs/Informe_Costos_y_Procedimiento_Cisternin.docx
+++ b/docs/Informe_Costos_y_Procedimiento_Cisternin.docx
@@ -24,21 +24,21 @@
     </w:p>
     <w:p>
       <w:pPr>
-        <w:spacing w:before="160" w:after="80"/>
+        <w:spacing w:before="120" w:after="40"/>
       </w:pPr>
       <w:r>
         <w:rPr>
           <w:rFonts w:ascii="Calibri" w:hAnsi="Calibri"/>
           <w:b/>
           <w:color w:val="1A365D"/>
-          <w:sz w:val="36"/>
+          <w:sz w:val="34"/>
         </w:rPr>
         <w:t>INFORME EJECUTIVO: COSTOS Y PROCEDIMIENTO</w:t>
       </w:r>
     </w:p>
     <w:p>
       <w:pPr>
-        <w:spacing w:after="240"/>
+        <w:spacing w:after="200"/>
       </w:pPr>
       <w:r>
         <w:rPr>
@@ -159,46 +159,46 @@
     </w:tbl>
     <w:p>
       <w:pPr>
-        <w:spacing w:before="160" w:after="160"/>
+        <w:spacing w:before="120" w:after="120"/>
       </w:pPr>
     </w:p>
     <w:p>
       <w:pPr>
-        <w:spacing w:before="200" w:after="80"/>
+        <w:spacing w:before="160" w:after="60"/>
       </w:pPr>
       <w:r>
         <w:rPr>
           <w:rFonts w:ascii="Calibri" w:hAnsi="Calibri"/>
           <w:b/>
           <w:color w:val="1A365D"/>
-          <w:sz w:val="26"/>
+          <w:sz w:val="24"/>
         </w:rPr>
         <w:t>1. Objetivo del Proyecto</w:t>
       </w:r>
     </w:p>
     <w:p>
       <w:pPr>
-        <w:spacing w:after="160"/>
+        <w:spacing w:after="120"/>
       </w:pPr>
       <w:r>
         <w:rPr>
           <w:rFonts w:ascii="Calibri" w:hAnsi="Calibri"/>
           <w:color w:val="1A202C"/>
-          <w:sz w:val="21"/>
+          <w:sz w:val="20"/>
         </w:rPr>
-        <w:t>Disponer de un canal de atención ciudadana automatizado (Cisternin) que oriente a los vecinos las 24 horas del día, los 7 días de la semana, en trámites municipales frecuentes (licencias de conducir, permisos de circulación, farmacia comunal, beneficios sociales, aseo y patentes). Si la consulta requiere gestión presencial o personalizada, el sistema deriva de forma inmediata al canal oficial de WhatsApp del municipio.</w:t>
+        <w:t>Disponer de un canal de atención ciudadana automatizado (Cisternin) que oriente a los vecinos las 24 horas del día, los 7 días de la semana, en trámites municipales frecuentes (licencias de conducir, permisos de circulación, farmacia comunal, beneficios sociales, aseo y patentes). Si la consulta requiere gestión personalizada o un trámite presencial específico, el asistente conecta de forma directa al vecino con la línea oficial de WhatsApp del municipio.</w:t>
       </w:r>
     </w:p>
     <w:p>
       <w:pPr>
-        <w:spacing w:before="200" w:after="80"/>
+        <w:spacing w:before="160" w:after="60"/>
       </w:pPr>
       <w:r>
         <w:rPr>
           <w:rFonts w:ascii="Calibri" w:hAnsi="Calibri"/>
           <w:b/>
           <w:color w:val="1A365D"/>
-          <w:sz w:val="26"/>
+          <w:sz w:val="24"/>
         </w:rPr>
         <w:t>2. Costos y Presupuesto Requerido</w:t>
       </w:r>
@@ -210,9 +210,9 @@
       <w:r>
         <w:rPr>
           <w:rFonts w:ascii="Calibri" w:hAnsi="Calibri"/>
-          <w:sz w:val="21"/>
+          <w:sz w:val="20"/>
         </w:rPr>
-        <w:t>El asistente utiliza tecnología de lenguaje natural de alta eficiencia (pago por consumo real). A continuación se detallan el costo unitario por consulta, el consumo estimado y el presupuesto de seguridad solicitado:</w:t>
+        <w:t>El asistente utiliza tecnología de lenguaje natural de alta eficiencia (bajo modalidad de pago por uso real). A continuación se detallan el costo unitario por consulta, el consumo estimado y el presupuesto de seguridad solicitado:</w:t>
       </w:r>
     </w:p>
     <w:tbl>
@@ -232,10 +232,10 @@
             <w:tcW w:type="dxa" w:w="3312"/>
             <w:shd w:fill="1A365D"/>
             <w:tcMar>
-              <w:top w:w="100" w:type="dxa"/>
-              <w:bottom w:w="100" w:type="dxa"/>
-              <w:left w:w="120" w:type="dxa"/>
-              <w:right w:w="120" w:type="dxa"/>
+              <w:top w:w="90" w:type="dxa"/>
+              <w:bottom w:w="90" w:type="dxa"/>
+              <w:left w:w="100" w:type="dxa"/>
+              <w:right w:w="100" w:type="dxa"/>
             </w:tcMar>
           </w:tcPr>
           <w:p>
@@ -244,7 +244,7 @@
                 <w:rFonts w:ascii="Calibri" w:hAnsi="Calibri"/>
                 <w:b/>
                 <w:color w:val="FFFFFF"/>
-                <w:sz w:val="20"/>
+                <w:sz w:val="19"/>
               </w:rPr>
               <w:t>Concepto / Parámetro</w:t>
             </w:r>
@@ -255,10 +255,10 @@
             <w:tcW w:type="dxa" w:w="3312"/>
             <w:shd w:fill="1A365D"/>
             <w:tcMar>
-              <w:top w:w="100" w:type="dxa"/>
-              <w:bottom w:w="100" w:type="dxa"/>
-              <w:left w:w="120" w:type="dxa"/>
-              <w:right w:w="120" w:type="dxa"/>
+              <w:top w:w="90" w:type="dxa"/>
+              <w:bottom w:w="90" w:type="dxa"/>
+              <w:left w:w="100" w:type="dxa"/>
+              <w:right w:w="100" w:type="dxa"/>
             </w:tcMar>
           </w:tcPr>
           <w:p>
@@ -267,7 +267,7 @@
                 <w:rFonts w:ascii="Calibri" w:hAnsi="Calibri"/>
                 <w:b/>
                 <w:color w:val="FFFFFF"/>
-                <w:sz w:val="20"/>
+                <w:sz w:val="19"/>
               </w:rPr>
               <w:t>Consumo Real Estimado (1.000 consultas/día)</w:t>
             </w:r>
@@ -278,10 +278,10 @@
             <w:tcW w:type="dxa" w:w="3312"/>
             <w:shd w:fill="1A365D"/>
             <w:tcMar>
-              <w:top w:w="100" w:type="dxa"/>
-              <w:bottom w:w="100" w:type="dxa"/>
-              <w:left w:w="120" w:type="dxa"/>
-              <w:right w:w="120" w:type="dxa"/>
+              <w:top w:w="90" w:type="dxa"/>
+              <w:bottom w:w="90" w:type="dxa"/>
+              <w:left w:w="100" w:type="dxa"/>
+              <w:right w:w="100" w:type="dxa"/>
             </w:tcMar>
           </w:tcPr>
           <w:p>
@@ -290,7 +290,7 @@
                 <w:rFonts w:ascii="Calibri" w:hAnsi="Calibri"/>
                 <w:b/>
                 <w:color w:val="FFFFFF"/>
-                <w:sz w:val="20"/>
+                <w:sz w:val="19"/>
               </w:rPr>
               <w:t>Presupuesto Solicitado (Techo Máximo)</w:t>
             </w:r>
@@ -303,10 +303,10 @@
             <w:tcW w:type="dxa" w:w="3312"/>
             <w:shd w:fill="EDF2F7"/>
             <w:tcMar>
-              <w:top w:w="80" w:type="dxa"/>
-              <w:bottom w:w="80" w:type="dxa"/>
-              <w:left w:w="120" w:type="dxa"/>
-              <w:right w:w="120" w:type="dxa"/>
+              <w:top w:w="70" w:type="dxa"/>
+              <w:bottom w:w="70" w:type="dxa"/>
+              <w:left w:w="100" w:type="dxa"/>
+              <w:right w:w="100" w:type="dxa"/>
             </w:tcMar>
           </w:tcPr>
           <w:p>
@@ -324,10 +324,10 @@
             <w:tcW w:type="dxa" w:w="3312"/>
             <w:shd w:fill="EDF2F7"/>
             <w:tcMar>
-              <w:top w:w="80" w:type="dxa"/>
-              <w:bottom w:w="80" w:type="dxa"/>
-              <w:left w:w="120" w:type="dxa"/>
-              <w:right w:w="120" w:type="dxa"/>
+              <w:top w:w="70" w:type="dxa"/>
+              <w:bottom w:w="70" w:type="dxa"/>
+              <w:left w:w="100" w:type="dxa"/>
+              <w:right w:w="100" w:type="dxa"/>
             </w:tcMar>
           </w:tcPr>
           <w:p>
@@ -336,7 +336,7 @@
                 <w:rFonts w:ascii="Calibri" w:hAnsi="Calibri"/>
                 <w:sz w:val="19"/>
               </w:rPr>
-              <w:t>/usr/bin/bash,14 CLP / pregunta</w:t>
+              <w:t>$0,14 CLP / pregunta</w:t>
             </w:r>
           </w:p>
         </w:tc>
@@ -345,10 +345,10 @@
             <w:tcW w:type="dxa" w:w="3312"/>
             <w:shd w:fill="EDF2F7"/>
             <w:tcMar>
-              <w:top w:w="80" w:type="dxa"/>
-              <w:bottom w:w="80" w:type="dxa"/>
-              <w:left w:w="120" w:type="dxa"/>
-              <w:right w:w="120" w:type="dxa"/>
+              <w:top w:w="70" w:type="dxa"/>
+              <w:bottom w:w="70" w:type="dxa"/>
+              <w:left w:w="100" w:type="dxa"/>
+              <w:right w:w="100" w:type="dxa"/>
             </w:tcMar>
           </w:tcPr>
           <w:p>
@@ -368,10 +368,10 @@
             <w:tcW w:type="dxa" w:w="3312"/>
             <w:shd w:fill="FFFFFF"/>
             <w:tcMar>
-              <w:top w:w="80" w:type="dxa"/>
-              <w:bottom w:w="80" w:type="dxa"/>
-              <w:left w:w="120" w:type="dxa"/>
-              <w:right w:w="120" w:type="dxa"/>
+              <w:top w:w="70" w:type="dxa"/>
+              <w:bottom w:w="70" w:type="dxa"/>
+              <w:left w:w="100" w:type="dxa"/>
+              <w:right w:w="100" w:type="dxa"/>
             </w:tcMar>
           </w:tcPr>
           <w:p>
@@ -389,10 +389,10 @@
             <w:tcW w:type="dxa" w:w="3312"/>
             <w:shd w:fill="FFFFFF"/>
             <w:tcMar>
-              <w:top w:w="80" w:type="dxa"/>
-              <w:bottom w:w="80" w:type="dxa"/>
-              <w:left w:w="120" w:type="dxa"/>
-              <w:right w:w="120" w:type="dxa"/>
+              <w:top w:w="70" w:type="dxa"/>
+              <w:bottom w:w="70" w:type="dxa"/>
+              <w:left w:w="100" w:type="dxa"/>
+              <w:right w:w="100" w:type="dxa"/>
             </w:tcMar>
           </w:tcPr>
           <w:p>
@@ -401,7 +401,7 @@
                 <w:rFonts w:ascii="Calibri" w:hAnsi="Calibri"/>
                 <w:sz w:val="19"/>
               </w:rPr>
-              <w:t>~.300 CLP / mes (aprox. ,5 USD)</w:t>
+              <w:t>$4.275 CLP / mes (aprox. $4,50 USD)</w:t>
             </w:r>
           </w:p>
         </w:tc>
@@ -410,10 +410,10 @@
             <w:tcW w:type="dxa" w:w="3312"/>
             <w:shd w:fill="FFFFFF"/>
             <w:tcMar>
-              <w:top w:w="80" w:type="dxa"/>
-              <w:bottom w:w="80" w:type="dxa"/>
-              <w:left w:w="120" w:type="dxa"/>
-              <w:right w:w="120" w:type="dxa"/>
+              <w:top w:w="70" w:type="dxa"/>
+              <w:bottom w:w="70" w:type="dxa"/>
+              <w:left w:w="100" w:type="dxa"/>
+              <w:right w:w="100" w:type="dxa"/>
             </w:tcMar>
           </w:tcPr>
           <w:p>
@@ -424,7 +424,7 @@
                 <w:color w:val="1A365D"/>
                 <w:sz w:val="19"/>
               </w:rPr>
-              <w:t>00.000 CLP / mes</w:t>
+              <w:t>$100.000 CLP / mes</w:t>
             </w:r>
           </w:p>
         </w:tc>
@@ -435,10 +435,10 @@
             <w:tcW w:type="dxa" w:w="3312"/>
             <w:shd w:fill="EDF2F7"/>
             <w:tcMar>
-              <w:top w:w="80" w:type="dxa"/>
-              <w:bottom w:w="80" w:type="dxa"/>
-              <w:left w:w="120" w:type="dxa"/>
-              <w:right w:w="120" w:type="dxa"/>
+              <w:top w:w="70" w:type="dxa"/>
+              <w:bottom w:w="70" w:type="dxa"/>
+              <w:left w:w="100" w:type="dxa"/>
+              <w:right w:w="100" w:type="dxa"/>
             </w:tcMar>
           </w:tcPr>
           <w:p>
@@ -456,10 +456,10 @@
             <w:tcW w:type="dxa" w:w="3312"/>
             <w:shd w:fill="EDF2F7"/>
             <w:tcMar>
-              <w:top w:w="80" w:type="dxa"/>
-              <w:bottom w:w="80" w:type="dxa"/>
-              <w:left w:w="120" w:type="dxa"/>
-              <w:right w:w="120" w:type="dxa"/>
+              <w:top w:w="70" w:type="dxa"/>
+              <w:bottom w:w="70" w:type="dxa"/>
+              <w:left w:w="100" w:type="dxa"/>
+              <w:right w:w="100" w:type="dxa"/>
             </w:tcMar>
           </w:tcPr>
           <w:p>
@@ -468,7 +468,7 @@
                 <w:rFonts w:ascii="Calibri" w:hAnsi="Calibri"/>
                 <w:sz w:val="19"/>
               </w:rPr>
-              <w:t>~1.300 CLP / año</w:t>
+              <w:t>$51.300 CLP / año</w:t>
             </w:r>
           </w:p>
         </w:tc>
@@ -477,10 +477,10 @@
             <w:tcW w:type="dxa" w:w="3312"/>
             <w:shd w:fill="EDF2F7"/>
             <w:tcMar>
-              <w:top w:w="80" w:type="dxa"/>
-              <w:bottom w:w="80" w:type="dxa"/>
-              <w:left w:w="120" w:type="dxa"/>
-              <w:right w:w="120" w:type="dxa"/>
+              <w:top w:w="70" w:type="dxa"/>
+              <w:bottom w:w="70" w:type="dxa"/>
+              <w:left w:w="100" w:type="dxa"/>
+              <w:right w:w="100" w:type="dxa"/>
             </w:tcMar>
           </w:tcPr>
           <w:p>
@@ -491,7 +491,7 @@
                 <w:color w:val="1A365D"/>
                 <w:sz w:val="19"/>
               </w:rPr>
-              <w:t>.200.000 CLP / año (1.2 Millones)</w:t>
+              <w:t>$1.200.000 CLP / año (1,2 Millones)</w:t>
             </w:r>
           </w:p>
         </w:tc>
@@ -502,10 +502,10 @@
             <w:tcW w:type="dxa" w:w="3312"/>
             <w:shd w:fill="FFFFFF"/>
             <w:tcMar>
-              <w:top w:w="80" w:type="dxa"/>
-              <w:bottom w:w="80" w:type="dxa"/>
-              <w:left w:w="120" w:type="dxa"/>
-              <w:right w:w="120" w:type="dxa"/>
+              <w:top w:w="70" w:type="dxa"/>
+              <w:bottom w:w="70" w:type="dxa"/>
+              <w:left w:w="100" w:type="dxa"/>
+              <w:right w:w="100" w:type="dxa"/>
             </w:tcMar>
           </w:tcPr>
           <w:p>
@@ -523,10 +523,10 @@
             <w:tcW w:type="dxa" w:w="3312"/>
             <w:shd w:fill="FFFFFF"/>
             <w:tcMar>
-              <w:top w:w="80" w:type="dxa"/>
-              <w:bottom w:w="80" w:type="dxa"/>
-              <w:left w:w="120" w:type="dxa"/>
-              <w:right w:w="120" w:type="dxa"/>
+              <w:top w:w="70" w:type="dxa"/>
+              <w:bottom w:w="70" w:type="dxa"/>
+              <w:left w:w="100" w:type="dxa"/>
+              <w:right w:w="100" w:type="dxa"/>
             </w:tcMar>
           </w:tcPr>
           <w:p>
@@ -535,7 +535,7 @@
                 <w:rFonts w:ascii="Calibri" w:hAnsi="Calibri"/>
                 <w:sz w:val="19"/>
               </w:rPr>
-              <w:t>~02.600 CLP / 2 años</w:t>
+              <w:t>$102.600 CLP / 2 años</w:t>
             </w:r>
           </w:p>
         </w:tc>
@@ -544,10 +544,10 @@
             <w:tcW w:type="dxa" w:w="3312"/>
             <w:shd w:fill="FFFFFF"/>
             <w:tcMar>
-              <w:top w:w="80" w:type="dxa"/>
-              <w:bottom w:w="80" w:type="dxa"/>
-              <w:left w:w="120" w:type="dxa"/>
-              <w:right w:w="120" w:type="dxa"/>
+              <w:top w:w="70" w:type="dxa"/>
+              <w:bottom w:w="70" w:type="dxa"/>
+              <w:left w:w="100" w:type="dxa"/>
+              <w:right w:w="100" w:type="dxa"/>
             </w:tcMar>
           </w:tcPr>
           <w:p>
@@ -558,7 +558,7 @@
                 <w:color w:val="1A365D"/>
                 <w:sz w:val="19"/>
               </w:rPr>
-              <w:t>.400.000 CLP (2.4 Millones)</w:t>
+              <w:t>$2.400.000 CLP (2,4 Millones)</w:t>
             </w:r>
           </w:p>
         </w:tc>
@@ -566,49 +566,49 @@
     </w:tbl>
     <w:p>
       <w:pPr>
-        <w:spacing w:before="160" w:after="160"/>
+        <w:spacing w:before="120" w:after="120"/>
       </w:pPr>
       <w:r>
         <w:rPr>
           <w:rFonts w:ascii="Calibri" w:hAnsi="Calibri"/>
           <w:color w:val="4A5568"/>
-          <w:sz w:val="19"/>
+          <w:sz w:val="18"/>
         </w:rPr>
-        <w:t>¿Por qué se solicita un presupuesto de 00.000 mensuales si el consumo base es menor?</w:t>
+        <w:t>¿Por qué se solicita un presupuesto de $100.000 mensuales si el consumo estimado es menor?</w:t>
         <w:br/>
-        <w:t>• Variabilidad de preguntas: Un vecino puede realizar entre 1 y 10 preguntas en una misma sesión para resolver trámites encadenados.</w:t>
+        <w:t>• Múltiples preguntas por sesión: Un vecino suele realizar entre 2 y 5 preguntas en una misma conversación para resolver trámites encadenados.</w:t>
         <w:br/>
-        <w:t>• Picos estacionales de alta demanda: En periodos críticos (como marzo con permisos de circulación o patentes comerciales), el volumen de consultas se multiplica significativamente.</w:t>
+        <w:t>• Picos estacionales de alta demanda: En periodos críticos (como marzo con permisos de circulación o patentes comerciales), el volumen de consultas aumenta considerablemente.</w:t>
         <w:br/>
-        <w:t>• Cero riesgo de saldo no utilizado: El servicio opera bajo modalidad de pago por uso real. Los recursos no consumidos permanecen en la cuenta municipal y no representan gasto adicional.</w:t>
+        <w:t>• Pago por uso real (sin riesgo de pérdida): El presupuesto asignado funciona como un saldo máximo. Todo monto que no se consuma permanece en la cuenta municipal, sin costos ocultos.</w:t>
       </w:r>
     </w:p>
     <w:p>
       <w:pPr>
-        <w:spacing w:before="240" w:after="80"/>
+        <w:spacing w:before="200" w:after="60"/>
       </w:pPr>
       <w:r>
         <w:rPr>
           <w:rFonts w:ascii="Calibri" w:hAnsi="Calibri"/>
           <w:b/>
           <w:color w:val="1A365D"/>
-          <w:sz w:val="26"/>
+          <w:sz w:val="24"/>
         </w:rPr>
         <w:t>3. Procedimiento de Implementación (Paso a Paso)</w:t>
       </w:r>
     </w:p>
     <w:p>
       <w:pPr>
-        <w:spacing w:before="80" w:after="80"/>
+        <w:spacing w:before="60" w:after="60"/>
       </w:pPr>
       <w:r>
         <w:rPr>
           <w:rFonts w:ascii="Calibri" w:hAnsi="Calibri"/>
           <w:b/>
           <w:color w:val="128C7E"/>
-          <w:sz w:val="20"/>
+          <w:sz w:val="19"/>
         </w:rPr>
-        <w:t>• Paso 1: Aprobación y Activación Presupuestaria:</w:t>
+        <w:t>• Paso 1: Aprobación y Asignación Presupuestaria:</w:t>
         <w:br/>
       </w:r>
       <w:r>
@@ -617,19 +617,19 @@
           <w:color w:val="1A202C"/>
           <w:sz w:val="19"/>
         </w:rPr>
-        <w:t xml:space="preserve">  Asignar el presupuesto de 00.000 CLP mensuales (.200.000 anuales) mediante tarjeta de crédito institucional o cuenta de facturación oficial para el servicio de inferencia de lenguaje.</w:t>
+        <w:t xml:space="preserve">  Habilitar el cupo mensual de $100.000 CLP ($1.200.000 CLP anuales) con tarjeta institucional o cuenta de facturación oficial para el servicio de inferencia de lenguaje.</w:t>
       </w:r>
     </w:p>
     <w:p>
       <w:pPr>
-        <w:spacing w:before="80" w:after="80"/>
+        <w:spacing w:before="60" w:after="60"/>
       </w:pPr>
       <w:r>
         <w:rPr>
           <w:rFonts w:ascii="Calibri" w:hAnsi="Calibri"/>
           <w:b/>
           <w:color w:val="128C7E"/>
-          <w:sz w:val="20"/>
+          <w:sz w:val="19"/>
         </w:rPr>
         <w:t>• Paso 2: Integración en la Página Web Municipal (1 Día):</w:t>
         <w:br/>
@@ -640,21 +640,21 @@
           <w:color w:val="1A202C"/>
           <w:sz w:val="19"/>
         </w:rPr>
-        <w:t xml:space="preserve">  El equipo de desarrollo web de la municipalidad solo debe insertar un código estándar (widget flotante) en el portal www.cisterna.cl. No requiere modificar bases de datos ni tocar el backend del portal.</w:t>
+        <w:t xml:space="preserve">  El equipo web de la municipalidad solo debe insertar un código estándar (widget flotante) en el portal www.cisterna.cl. No requiere modificar bases de datos ni tocar el backend del portal.</w:t>
       </w:r>
     </w:p>
     <w:p>
       <w:pPr>
-        <w:spacing w:before="80" w:after="80"/>
+        <w:spacing w:before="60" w:after="60"/>
       </w:pPr>
       <w:r>
         <w:rPr>
           <w:rFonts w:ascii="Calibri" w:hAnsi="Calibri"/>
           <w:b/>
           <w:color w:val="128C7E"/>
-          <w:sz w:val="20"/>
+          <w:sz w:val="19"/>
         </w:rPr>
-        <w:t>• Paso 3: Puesta en Marcha y Atención 24/7:</w:t>
+        <w:t>• Paso 3: Puesta en Marcha y Atención Continua 24/7:</w:t>
         <w:br/>
       </w:r>
       <w:r>
@@ -663,19 +663,19 @@
           <w:color w:val="1A202C"/>
           <w:sz w:val="19"/>
         </w:rPr>
-        <w:t xml:space="preserve">  Cisternin entra en funcionamiento de inmediato orientando a la comunidad. Ante trámites complejos o requerimientos específicos, deriva fluidamente a la línea de WhatsApp municipal.</w:t>
+        <w:t xml:space="preserve">  Cisternin inicia su atención inmediata resolviendo dudas cotidianas. Cuando la consulta requiere atención personalizada, deriva automáticamente al WhatsApp municipal.</w:t>
       </w:r>
     </w:p>
     <w:p>
       <w:pPr>
-        <w:spacing w:before="80" w:after="80"/>
+        <w:spacing w:before="60" w:after="60"/>
       </w:pPr>
       <w:r>
         <w:rPr>
           <w:rFonts w:ascii="Calibri" w:hAnsi="Calibri"/>
           <w:b/>
           <w:color w:val="128C7E"/>
-          <w:sz w:val="20"/>
+          <w:sz w:val="19"/>
         </w:rPr>
         <w:t>• Paso 4: Supervisión, Reportes y Auditoría:</w:t>
         <w:br/>
@@ -686,74 +686,74 @@
           <w:color w:val="1A202C"/>
           <w:sz w:val="19"/>
         </w:rPr>
-        <w:t xml:space="preserve">  A través del portal administrativo interno (/docs), los directores y encargados municipales pueden visualizar en tiempo real los temas más consultados, cambiar contraseñas y descargar informes en Excel (CSV).</w:t>
+        <w:t xml:space="preserve">  A través del portal administrativo interno (/docs), los directores y encargados municipales pueden revisar en tiempo real los temas más consultados, cambiar contraseñas y descargar informes en Excel.</w:t>
       </w:r>
     </w:p>
     <w:p>
       <w:pPr>
-        <w:spacing w:before="240" w:after="80"/>
+        <w:spacing w:before="200" w:after="60"/>
       </w:pPr>
       <w:r>
         <w:rPr>
           <w:rFonts w:ascii="Calibri" w:hAnsi="Calibri"/>
           <w:b/>
           <w:color w:val="1A365D"/>
-          <w:sz w:val="26"/>
+          <w:sz w:val="24"/>
         </w:rPr>
         <w:t>4. Principales Beneficios para la Municipalidad</w:t>
       </w:r>
     </w:p>
     <w:p>
       <w:pPr>
-        <w:spacing w:after="60"/>
+        <w:spacing w:after="50"/>
       </w:pPr>
       <w:r>
         <w:rPr>
           <w:rFonts w:ascii="Calibri" w:hAnsi="Calibri"/>
           <w:sz w:val="19"/>
         </w:rPr>
-        <w:t>✓ Descongestión inmediata de mesones y líneas telefónicas al resolver dudas reiteritivas al instante.</w:t>
+        <w:t>✓ Descongestión inmediata de mesones de atención y teléfonos al responder consultas frecuentes al instante.</w:t>
       </w:r>
     </w:p>
     <w:p>
       <w:pPr>
-        <w:spacing w:after="60"/>
+        <w:spacing w:after="50"/>
       </w:pPr>
       <w:r>
         <w:rPr>
           <w:rFonts w:ascii="Calibri" w:hAnsi="Calibri"/>
           <w:sz w:val="19"/>
         </w:rPr>
-        <w:t>✓ Costo de licencias /usr/bin/bash: Toda la plataforma, base vectorial y sistema de chat son de propiedad y código abierto.</w:t>
+        <w:t>✓ Costo de licencias $0: Toda la plataforma, base vectorial y sistema de chat son de código abierto y propiedad municipal.</w:t>
       </w:r>
     </w:p>
     <w:p>
       <w:pPr>
-        <w:spacing w:after="60"/>
+        <w:spacing w:after="50"/>
       </w:pPr>
       <w:r>
         <w:rPr>
           <w:rFonts w:ascii="Calibri" w:hAnsi="Calibri"/>
           <w:sz w:val="19"/>
         </w:rPr>
-        <w:t>✓ Información oficial y actualizada: Alimenta sus respuestas directamente de documentos oficiales y vigentes.</w:t>
+        <w:t>✓ Información oficial y validada: Responde exclusivamente con base en documentos oficiales y vigentes de la municipalidad.</w:t>
       </w:r>
     </w:p>
     <w:p>
       <w:pPr>
-        <w:spacing w:after="60"/>
+        <w:spacing w:after="50"/>
       </w:pPr>
       <w:r>
         <w:rPr>
           <w:rFonts w:ascii="Calibri" w:hAnsi="Calibri"/>
           <w:sz w:val="19"/>
         </w:rPr>
-        <w:t>✓ Estadísticas reales para la gestión: Permite saber qué necesitan los vecinos y dónde enfocar recursos municipales.</w:t>
+        <w:t>✓ Estadísticas reales para la gestión: Permite conocer de primera fuente qué necesitan los vecinos y optimizar los servicios.</w:t>
       </w:r>
     </w:p>
     <w:sectPr>
       <w:pgSz w:w="12240" w:h="15840"/>
-      <w:pgMar w:top="1152" w:right="1152" w:bottom="1152" w:left="1152" w:header="720" w:footer="720" w:gutter="0"/>
+      <w:pgMar w:top="1080" w:right="1152" w:bottom="1080" w:left="1152" w:header="720" w:footer="720" w:gutter="0"/>
       <w:cols w:space="720"/>
       <w:docGrid w:linePitch="360"/>
     </w:sectPr>

</xml_diff>